<commit_message>
docs(okno-msk): correct report 02 A031 temporal attribution
</commit_message>
<xml_diff>
--- a/extension/docs/kwork/KW001_AI_NATIVE_YANDEX_ALICE/tests/OKNO_MSK/OKNO_MSK_RESEARCH_RELEASE_CORRECTED_2026-09-05/editable/02_OKNO_MSK_SEO_IMPLEMENTATION_GUIDE_RU_2026-09-05.docx
+++ b/extension/docs/kwork/KW001_AI_NATIVE_YANDEX_ALICE/tests/OKNO_MSK/OKNO_MSK_RESEARCH_RELEASE_CORRECTED_2026-09-05/editable/02_OKNO_MSK_SEO_IMPLEMENTATION_GUIDE_RU_2026-09-05.docx
@@ -1614,7 +1614,7 @@
         <w:rPr>
           <w:rFonts w:ascii="Calibri" w:hAnsi="Calibri" w:eastAsia="Calibri"/>
         </w:rPr>
-        <w:t xml:space="preserve">В разделе рейтинга выполнить только безопасную коррекцию исторической маркировки: убрать выражение «в этом году», прямо назвать материал опубликованным в 2024 году и отделить перечень брендов от сравнения конкретных систем. Сам рейтинг не обновлять.</w:t>
+        <w:t xml:space="preserve">В разделе «Рейтинг производителей оконных профилей» убрать формулировку, которая представляет рейтинг 2024 года как актуальный «в этом году»; прямо указать, что показанный рейтинг относится к 2024 году и не является обновлённым рейтингом на текущую дату; отделить сравнение брендов и производителей от выбора конкретной профильной системы, стеклопакета, фурнитуры и комплектации. Позиции рейтинга не обновлять, новую дату рейтинга не вводить и дату публикации статьи не утверждать.</w:t>
       </w:r>
     </w:p>
     <w:p>
@@ -1640,7 +1640,7 @@
         <w:rPr>
           <w:rFonts w:ascii="Calibri" w:hAnsi="Calibri" w:eastAsia="Calibri"/>
         </w:rPr>
-        <w:t xml:space="preserve">Внутри существующего раздела «Рейтинг производителей оконных профилей», непосредственно перед сохранённым списком производителей. Раздел и проблемная историческая формулировка зафиксированы завершённым исследованием.</w:t>
+        <w:t xml:space="preserve">В разделе «Рейтинг производителей оконных профилей», в той части, где рейтинг 2024 года назван актуальным «в этом году». Это самая точная граница, установленная завершённым исследованием.</w:t>
       </w:r>
     </w:p>
     <w:p>
@@ -1670,7 +1670,7 @@
         <w:rPr>
           <w:rFonts w:ascii="Calibri" w:hAnsi="Calibri" w:eastAsia="Calibri"/>
         </w:rPr>
-        <w:t xml:space="preserve">Найдите раздел «Рейтинг производителей оконных профилей» и сохраните существующий список производителей без перестановки позиций.</w:t>
+        <w:t xml:space="preserve">Откройте раздел «Рейтинг производителей оконных профилей».</w:t>
       </w:r>
     </w:p>
     <w:p>
@@ -1686,7 +1686,7 @@
         <w:rPr>
           <w:rFonts w:ascii="Calibri" w:hAnsi="Calibri" w:eastAsia="Calibri"/>
         </w:rPr>
-        <w:t xml:space="preserve">Сохраните прямую историческую привязку материала к 2024 году.</w:t>
+        <w:t xml:space="preserve">Сохраните существующий список производителей и его порядок.</w:t>
       </w:r>
     </w:p>
     <w:p>
@@ -1702,7 +1702,7 @@
         <w:rPr>
           <w:rFonts w:ascii="Calibri" w:hAnsi="Calibri" w:eastAsia="Calibri"/>
         </w:rPr>
-        <w:t xml:space="preserve">Уберите относящееся к списку выражение «в этом году» и замените его формулировкой из примера ниже.</w:t>
+        <w:t xml:space="preserve">Уберите формулировку, которая представляет рейтинг 2024 года как актуальный «в этом году».</w:t>
       </w:r>
     </w:p>
     <w:p>
@@ -1718,7 +1718,7 @@
         <w:rPr>
           <w:rFonts w:ascii="Calibri" w:hAnsi="Calibri" w:eastAsia="Calibri"/>
         </w:rPr>
-        <w:t xml:space="preserve">Перед списком поясните, что материал не является обновлённым рейтингом на текущую дату и сравнивает бренды в целом.</w:t>
+        <w:t xml:space="preserve">В начале рейтингового блока укажите, что приведённый рейтинг относится к 2024 году и не является обновлённым рейтингом на текущую дату.</w:t>
       </w:r>
     </w:p>
     <w:p>
@@ -1734,7 +1734,7 @@
         <w:rPr>
           <w:rFonts w:ascii="Calibri" w:hAnsi="Calibri" w:eastAsia="Calibri"/>
         </w:rPr>
-        <w:t xml:space="preserve">Не добавляйте новую дату проверки и не утверждайте, что позиции подтверждены актуальными источниками.</w:t>
+        <w:t xml:space="preserve">Добавьте пояснение, что выбор конкретного окна требует отдельного сравнения профильной системы, стеклопакета, фурнитуры и комплектации.</w:t>
       </w:r>
     </w:p>
     <w:p>
@@ -1750,7 +1750,7 @@
         <w:rPr>
           <w:rFonts w:ascii="Calibri" w:hAnsi="Calibri" w:eastAsia="Calibri"/>
         </w:rPr>
-        <w:t xml:space="preserve">Сохраните остальные критерии выбора, а сравнение конкретной системы, стеклопакета, фурнитуры и комплектации обозначьте отдельным уровнем выбора.</w:t>
+        <w:t xml:space="preserve">Не меняйте позиции рейтинга, не добавляйте новую дату и не утверждайте дату публикации статьи.</w:t>
       </w:r>
     </w:p>
     <w:p>
@@ -1766,7 +1766,7 @@
         <w:rPr>
           <w:rFonts w:ascii="Calibri" w:hAnsi="Calibri" w:eastAsia="Calibri"/>
         </w:rPr>
-        <w:t xml:space="preserve">Проверьте, что список 2024 года не представлен как текущий и в тексте нет незаполненных значений.</w:t>
+        <w:t xml:space="preserve">Проверьте, что 2024 год относится именно к рейтингу, а не ошибочно представлен как дата публикации материала.</w:t>
       </w:r>
     </w:p>
     <w:p>
@@ -1802,48 +1802,42 @@
       </w:pPr>
       <w:r>
         <w:rPr>
-          <w:rFonts w:ascii="Calibri" w:hAnsi="Calibri" w:eastAsia="Calibri"/>
-        </w:rPr>
-        <w:t xml:space="preserve">Заменить указание на текущий год на</w:t>
-      </w:r>
-      <w:r>
-        <w:rPr>
-          <w:rFonts w:ascii="Calibri" w:hAnsi="Calibri" w:eastAsia="Calibri"/>
-        </w:rPr>
-        <w:t xml:space="preserve"> </w:t>
-      </w:r>
-      <w:r>
-        <w:rPr>
           <w:bCs/>
           <w:rFonts w:ascii="Calibri" w:hAnsi="Calibri" w:eastAsia="Calibri"/>
           <w:b/>
         </w:rPr>
-        <w:t xml:space="preserve">«В опубликованном в 2024 году материале перечислены следующие производители:»</w:t>
-      </w:r>
-      <w:r>
-        <w:rPr>
-          <w:rFonts w:ascii="Calibri" w:hAnsi="Calibri" w:eastAsia="Calibri"/>
-        </w:rPr>
-        <w:t xml:space="preserve">. Добавить:</w:t>
-      </w:r>
-      <w:r>
-        <w:rPr>
-          <w:rFonts w:ascii="Calibri" w:hAnsi="Calibri" w:eastAsia="Calibri"/>
-        </w:rPr>
-        <w:t xml:space="preserve"> </w:t>
-      </w:r>
+        <w:t xml:space="preserve">«Ниже приведён рейтинг производителей за 2024 год. Он не является обновлённым рейтингом на текущую дату. При выборе конкретного окна отдельно сравнивают профильную систему, стеклопакет, фурнитуру и комплектацию».</w:t>
+      </w:r>
+    </w:p>
+    <w:p>
+      <w:pPr>
+        <w:pStyle w:val="FirstParagraph"/>
+        <w:widowControl/>
+      </w:pPr>
       <w:r>
         <w:rPr>
           <w:bCs/>
           <w:rFonts w:ascii="Calibri" w:hAnsi="Calibri" w:eastAsia="Calibri"/>
           <w:b/>
         </w:rPr>
-        <w:t xml:space="preserve">«Список отражает материал 2024 года и не является обновлённым рейтингом на текущую дату. Для выбора конструкции отдельно сравнивают конкретную профильную систему, стеклопакет, фурнитуру и комплектацию».</w:t>
-      </w:r>
-    </w:p>
-    <w:p>
-      <w:pPr>
-        <w:pStyle w:val="FirstParagraph"/>
+        <w:t xml:space="preserve">Что обязательно сохранить</w:t>
+      </w:r>
+    </w:p>
+    <w:p>
+      <w:pPr>
+        <w:pStyle w:val="BodyText"/>
+        <w:widowControl/>
+      </w:pPr>
+      <w:r>
+        <w:rPr>
+          <w:rFonts w:ascii="Calibri" w:hAnsi="Calibri" w:eastAsia="Calibri"/>
+        </w:rPr>
+        <w:t xml:space="preserve">URL статьи, список без перестановки позиций, полезные критерии выбора и существующую архитектуру раздела.</w:t>
+      </w:r>
+    </w:p>
+    <w:p>
+      <w:pPr>
+        <w:pStyle w:val="BodyText"/>
         <w:widowControl/>
       </w:pPr>
       <w:r>
@@ -1852,7 +1846,7 @@
           <w:rFonts w:ascii="Calibri" w:hAnsi="Calibri" w:eastAsia="Calibri"/>
           <w:b/>
         </w:rPr>
-        <w:t xml:space="preserve">Что обязательно сохранить</w:t>
+        <w:t xml:space="preserve">Чего нельзя добавлять / утверждать</w:t>
       </w:r>
     </w:p>
     <w:p>
@@ -1864,7 +1858,7 @@
         <w:rPr>
           <w:rFonts w:ascii="Calibri" w:hAnsi="Calibri" w:eastAsia="Calibri"/>
         </w:rPr>
-        <w:t xml:space="preserve">URL статьи, список без перестановки позиций, полезные критерии выбора и существующую архитектуру раздела.</w:t>
+        <w:t xml:space="preserve">Не подставлять новую дату, не менять позиции, не называть список актуальным или независимым рейтингом без отдельного исследования и не приписывать статье неподтверждённую дату публикации.</w:t>
       </w:r>
     </w:p>
     <w:p>
@@ -1878,7 +1872,7 @@
           <w:rFonts w:ascii="Calibri" w:hAnsi="Calibri" w:eastAsia="Calibri"/>
           <w:b/>
         </w:rPr>
-        <w:t xml:space="preserve">Чего нельзя добавлять / утверждать</w:t>
+        <w:t xml:space="preserve">Будущая отдельная работа — сейчас не внедрять</w:t>
       </w:r>
     </w:p>
     <w:p>
@@ -1890,7 +1884,7 @@
         <w:rPr>
           <w:rFonts w:ascii="Calibri" w:hAnsi="Calibri" w:eastAsia="Calibri"/>
         </w:rPr>
-        <w:t xml:space="preserve">Не подставлять новую дату, не менять позиции и не называть список актуальным или независимым рейтингом без отдельного исследования.</w:t>
+        <w:t xml:space="preserve">Полное обновление рейтинга возможно только после отдельно санкционированной проверки критериев, источников и каждой позиции списка.</w:t>
       </w:r>
     </w:p>
     <w:p>
@@ -1904,7 +1898,7 @@
           <w:rFonts w:ascii="Calibri" w:hAnsi="Calibri" w:eastAsia="Calibri"/>
           <w:b/>
         </w:rPr>
-        <w:t xml:space="preserve">Будущая отдельная работа — сейчас не внедрять</w:t>
+        <w:t xml:space="preserve">Как проверить выполнение</w:t>
       </w:r>
     </w:p>
     <w:p>
@@ -1916,33 +1910,7 @@
         <w:rPr>
           <w:rFonts w:ascii="Calibri" w:hAnsi="Calibri" w:eastAsia="Calibri"/>
         </w:rPr>
-        <w:t xml:space="preserve">Полное обновление рейтинга возможно только после отдельно санкционированной проверки критериев, источников и каждой позиции списка.</w:t>
-      </w:r>
-    </w:p>
-    <w:p>
-      <w:pPr>
-        <w:pStyle w:val="BodyText"/>
-        <w:widowControl/>
-      </w:pPr>
-      <w:r>
-        <w:rPr>
-          <w:bCs/>
-          <w:rFonts w:ascii="Calibri" w:hAnsi="Calibri" w:eastAsia="Calibri"/>
-          <w:b/>
-        </w:rPr>
-        <w:t xml:space="preserve">Как проверить выполнение</w:t>
-      </w:r>
-    </w:p>
-    <w:p>
-      <w:pPr>
-        <w:pStyle w:val="BodyText"/>
-        <w:widowControl/>
-      </w:pPr>
-      <w:r>
-        <w:rPr>
-          <w:rFonts w:ascii="Calibri" w:hAnsi="Calibri" w:eastAsia="Calibri"/>
-        </w:rPr>
-        <w:t xml:space="preserve">Список 2024 года не выдан за текущий; 2024 год назван прямо; бренды отделены от конкретных систем; позиции не переставлены; новой даты и заполнителей нет.</w:t>
+        <w:t xml:space="preserve">2024 год отнесён именно к рейтингу; рейтинг не выдан за текущий; дата публикации статьи не утверждается; бренды отделены от конкретных систем; позиции не переставлены; новой даты и заполнителей нет.</w:t>
       </w:r>
     </w:p>
     <w:bookmarkEnd w:id="28"/>

</xml_diff>